<commit_message>
feat: cap nhat 10 de KTGK + test cases moi (NHAPAM, NHAPKHONGAM, NHAPCANH, NHAPBANKINH, NHAPCHAN, NHAPLE, NHAPLECHUC, NHAPTRONCHUC, INSOGIAM1, INSOGIAM2)
</commit_message>
<xml_diff>
--- a/public/data/DE_KTGK/1.docx
+++ b/public/data/DE_KTGK/1.docx
@@ -12,26 +12,23 @@
           <w:color w:val="1F4E79"/>
           <w:sz w:val="24"/>
         </w:rPr>
-        <w:t>📌 ĐỀ SỐ 01: KIỂM TRA KẾT QUẢ HỌC TẬP</w:t>
+        <w:t xml:space="preserve">📌 ĐỀ SỐ 01: </w:t>
       </w:r>
-    </w:p>
-    <w:p>
-      <w:pPr>
-        <w:spacing w:after="80"/>
-      </w:pPr>
       <w:r>
         <w:rPr>
           <w:b/>
-          <w:sz w:val="20"/>
+          <w:color w:val="1F4E79"/>
+          <w:sz w:val="24"/>
         </w:rPr>
-        <w:t xml:space="preserve">Phạm vi kiến thức: </w:t>
+        <w:t>ĐIỀU KHIỂN NHẬP SỐ NGUYÊN</w:t>
       </w:r>
       <w:r>
         <w:rPr>
-          <w:i/>
-          <w:sz w:val="20"/>
+          <w:b/>
+          <w:color w:val="1F4E79"/>
+          <w:sz w:val="24"/>
         </w:rPr>
-        <w:t>Bài 18 (Vào ra) + Bài 19 (Rẽ nhánh if-else)</w:t>
+        <w:t xml:space="preserve"> ÂM</w:t>
       </w:r>
     </w:p>
     <w:tbl>
@@ -67,7 +64,40 @@
               <w:t xml:space="preserve">Yêu cầu đề bài: </w:t>
             </w:r>
             <w:r>
-              <w:t>Viết chương trình nhập vào điểm trung bình môn Tin học của học sinh (kiểu số thực float). Kiểm tra nếu điểm &gt;= 5.0 thì in ra màn hình 'DAT', ngược lại in ra 'CHUA DAT'.</w:t>
+              <w:t xml:space="preserve">Viết chương trình nhập vào </w:t>
+            </w:r>
+            <w:r>
+              <w:t>số x</w:t>
+            </w:r>
+            <w:r>
+              <w:t xml:space="preserve"> (kiểu số </w:t>
+            </w:r>
+            <w:r>
+              <w:t>nguyên: int</w:t>
+            </w:r>
+            <w:r>
+              <w:t xml:space="preserve">). Kiểm tra nếu </w:t>
+            </w:r>
+            <w:r>
+              <w:t>x</w:t>
+            </w:r>
+            <w:r>
+              <w:t xml:space="preserve"> &gt;</w:t>
+            </w:r>
+            <w:r>
+              <w:t>=</w:t>
+            </w:r>
+            <w:r>
+              <w:t xml:space="preserve"> 0 thì </w:t>
+            </w:r>
+            <w:r>
+              <w:t xml:space="preserve">điều khiển nhập lại cho đến x &lt; 0 thì xuất </w:t>
+            </w:r>
+            <w:r>
+              <w:t>“DA NHAP SO AM”</w:t>
+            </w:r>
+            <w:r>
+              <w:t>.</w:t>
             </w:r>
           </w:p>
         </w:tc>
@@ -97,7 +127,25 @@
               <w:rPr>
                 <w:color w:val="006600"/>
               </w:rPr>
-              <w:t>Đầu vào (Input): 4.5  |  Đầu ra (Output): CHUA DAT</w:t>
+              <w:t xml:space="preserve">Đầu vào (Input): </w:t>
+            </w:r>
+            <w:r>
+              <w:rPr>
+                <w:color w:val="006600"/>
+              </w:rPr>
+              <w:t>5 3 2 -1</w:t>
+            </w:r>
+            <w:r>
+              <w:rPr>
+                <w:color w:val="006600"/>
+              </w:rPr>
+              <w:t xml:space="preserve">  |  Đầu ra (Output): </w:t>
+            </w:r>
+            <w:r>
+              <w:rPr>
+                <w:color w:val="006600"/>
+              </w:rPr>
+              <w:t>DA NHAP SO AM</w:t>
             </w:r>
           </w:p>
         </w:tc>
@@ -105,8 +153,7 @@
     </w:tbl>
     <w:p/>
     <w:sectPr>
-      <w:headerReference w:type="default" r:id="rId8"/>
-      <w:footerReference w:type="default" r:id="rId9"/>
+      <w:footerReference w:type="default" r:id="rId8"/>
       <w:pgSz w:w="12240" w:h="15840"/>
       <w:pgMar w:top="1152" w:right="1152" w:bottom="1152" w:left="1152" w:header="720" w:footer="720" w:gutter="0"/>
       <w:cols w:space="720"/>
@@ -200,25 +247,6 @@
     </w:p>
   </w:footnote>
 </w:footnotes>
-</file>
-
-<file path=word/header1.xml><?xml version="1.0" encoding="utf-8"?>
-<w:hdr xmlns:wpc="http://schemas.microsoft.com/office/word/2010/wordprocessingCanvas" xmlns:cx="http://schemas.microsoft.com/office/drawing/2014/chartex" xmlns:cx1="http://schemas.microsoft.com/office/drawing/2015/9/8/chartex" xmlns:cx2="http://schemas.microsoft.com/office/drawing/2015/10/21/chartex" xmlns:cx3="http://schemas.microsoft.com/office/drawing/2016/5/9/chartex" xmlns:cx4="http://schemas.microsoft.com/office/drawing/2016/5/10/chartex" xmlns:cx5="http://schemas.microsoft.com/office/drawing/2016/5/11/chartex" xmlns:cx6="http://schemas.microsoft.com/office/drawing/2016/5/12/chartex" xmlns:cx7="http://schemas.microsoft.com/office/drawing/2016/5/13/chartex" xmlns:cx8="http://schemas.microsoft.com/office/drawing/2016/5/14/chartex" xmlns:mc="http://schemas.openxmlformats.org/markup-compatibility/2006" xmlns:aink="http://schemas.microsoft.com/office/drawing/2016/ink" xmlns:am3d="http://schemas.microsoft.com/office/drawing/2017/model3d" xmlns:o="urn:schemas-microsoft-com:office:office" xmlns:oel="http://schemas.microsoft.com/office/2019/extlst" xmlns:r="http://schemas.openxmlformats.org/officeDocument/2006/relationships" xmlns:m="http://schemas.openxmlformats.org/officeDocument/2006/math" xmlns:v="urn:schemas-microsoft-com:vml" xmlns:wp14="http://schemas.microsoft.com/office/word/2010/wordprocessingDrawing" xmlns:wp="http://schemas.openxmlformats.org/drawingml/2006/wordprocessingDrawing" xmlns:w10="urn:schemas-microsoft-com:office:word" xmlns:w="http://schemas.openxmlformats.org/wordprocessingml/2006/main" xmlns:w14="http://schemas.microsoft.com/office/word/2010/wordml" xmlns:w15="http://schemas.microsoft.com/office/word/2012/wordml" xmlns:w16cex="http://schemas.microsoft.com/office/word/2018/wordml/cex" xmlns:w16cid="http://schemas.microsoft.com/office/word/2016/wordml/cid" xmlns:w16="http://schemas.microsoft.com/office/word/2018/wordml" xmlns:w16du="http://schemas.microsoft.com/office/word/2023/wordml/word16du" xmlns:w16sdtdh="http://schemas.microsoft.com/office/word/2020/wordml/sdtdatahash" xmlns:w16sdtfl="http://schemas.microsoft.com/office/word/2024/wordml/sdtformatlock" xmlns:w16se="http://schemas.microsoft.com/office/word/2015/wordml/symex" xmlns:wpg="http://schemas.microsoft.com/office/word/2010/wordprocessingGroup" xmlns:wpi="http://schemas.microsoft.com/office/word/2010/wordprocessingInk" xmlns:wne="http://schemas.microsoft.com/office/word/2006/wordml" xmlns:wps="http://schemas.microsoft.com/office/word/2010/wordprocessingShape" mc:Ignorable="w14 w15 w16se w16cid w16 w16cex w16sdtdh w16sdtfl w16du wp14">
-  <w:p>
-    <w:pPr>
-      <w:pStyle w:val="Header"/>
-      <w:jc w:val="right"/>
-    </w:pPr>
-    <w:r>
-      <w:rPr>
-        <w:i/>
-        <w:color w:val="777777"/>
-        <w:sz w:val="18"/>
-      </w:rPr>
-      <w:t>BỘ 10 ĐỀ KIỂM TRA THỰC HÀNH TIN HỌC 10 (BÀI 16 - BÀI 21)</w:t>
-    </w:r>
-  </w:p>
-</w:hdr>
 </file>
 
 <file path=word/numbering.xml><?xml version="1.0" encoding="utf-8"?>

</xml_diff>

<commit_message>
chore: cap nhat loi van chuan khao thi cho ca 12 de thi (khong mo san bieu thuc logic)
</commit_message>
<xml_diff>
--- a/public/data/DE_KTGK/1.docx
+++ b/public/data/DE_KTGK/1.docx
@@ -57,6 +57,7 @@
             </w:tcMar>
           </w:tcPr>
           <w:p>
+            <w:r/>
             <w:r>
               <w:rPr>
                 <w:b/>
@@ -64,40 +65,10 @@
               <w:t xml:space="preserve">Yêu cầu đề bài: </w:t>
             </w:r>
             <w:r>
-              <w:t xml:space="preserve">Viết chương trình nhập vào </w:t>
-            </w:r>
-            <w:r>
-              <w:t>số x</w:t>
-            </w:r>
-            <w:r>
-              <w:t xml:space="preserve"> (kiểu số </w:t>
-            </w:r>
-            <w:r>
-              <w:t>nguyên: int</w:t>
-            </w:r>
-            <w:r>
-              <w:t xml:space="preserve">). Kiểm tra nếu </w:t>
-            </w:r>
-            <w:r>
-              <w:t>x</w:t>
-            </w:r>
-            <w:r>
-              <w:t xml:space="preserve"> &gt;</w:t>
-            </w:r>
-            <w:r>
-              <w:t>=</w:t>
-            </w:r>
-            <w:r>
-              <w:t xml:space="preserve"> 0 thì </w:t>
-            </w:r>
-            <w:r>
-              <w:t xml:space="preserve">điều khiển nhập lại cho đến x &lt; 0 thì xuất </w:t>
-            </w:r>
-            <w:r>
-              <w:t>“DA NHAP SO AM”</w:t>
-            </w:r>
-            <w:r>
-              <w:t>.</w:t>
+              <w:rPr>
+                <w:b w:val="0"/>
+              </w:rPr>
+              <w:t>Viết chương trình yêu cầu nhập một số nguyên âm x từ bàn phím (kiểu int). Nếu người dùng nhập số không phải là số âm thì phải yêu cầu nhập lại liên tục cho đến khi nhận được một số nguyên âm thì dừng và in ra màn hình: DA NHAP SO AM.</w:t>
             </w:r>
           </w:p>
         </w:tc>

</xml_diff>

<commit_message>
fix(test): them print(bien) vao template+output de phan biet dieu kien bien (r<=0 vs r<0), cap nhat 36 testcase bao phu truong hop dac biet
</commit_message>
<xml_diff>
--- a/public/data/DE_KTGK/1.docx
+++ b/public/data/DE_KTGK/1.docx
@@ -92,31 +92,27 @@
               <w:rPr>
                 <w:b/>
               </w:rPr>
-              <w:t xml:space="preserve">Ví dụ Test Case — </w:t>
+              <w:t>Ví dụ Test Case — Đầu vào (Input): -3 0 -1 5 3 2 -1  |  Đầu ra (Output): DA NHAP SO AM và -1</w:t>
             </w:r>
             <w:r>
               <w:rPr>
                 <w:color w:val="006600"/>
               </w:rPr>
-              <w:t xml:space="preserve">Đầu vào (Input): </w:t>
             </w:r>
             <w:r>
               <w:rPr>
                 <w:color w:val="006600"/>
               </w:rPr>
-              <w:t>5 3 2 -1</w:t>
             </w:r>
             <w:r>
               <w:rPr>
                 <w:color w:val="006600"/>
               </w:rPr>
-              <w:t xml:space="preserve">  |  Đầu ra (Output): </w:t>
             </w:r>
             <w:r>
               <w:rPr>
                 <w:color w:val="006600"/>
               </w:rPr>
-              <w:t>DA NHAP SO AM</w:t>
             </w:r>
           </w:p>
         </w:tc>

</xml_diff>

<commit_message>
chore: chuan hoa khao thi dong bo 100% 36 testcase va docx cho ca 12 de thi
</commit_message>
<xml_diff>
--- a/public/data/DE_KTGK/1.docx
+++ b/public/data/DE_KTGK/1.docx
@@ -89,30 +89,7 @@
           </w:tcPr>
           <w:p>
             <w:r>
-              <w:rPr>
-                <w:b/>
-              </w:rPr>
-              <w:t>Ví dụ Test Case — Đầu vào (Input): -3 0 -1 5 3 2 -1  |  Đầu ra (Output): DA NHAP SO AM và -1</w:t>
-            </w:r>
-            <w:r>
-              <w:rPr>
-                <w:color w:val="006600"/>
-              </w:rPr>
-            </w:r>
-            <w:r>
-              <w:rPr>
-                <w:color w:val="006600"/>
-              </w:rPr>
-            </w:r>
-            <w:r>
-              <w:rPr>
-                <w:color w:val="006600"/>
-              </w:rPr>
-            </w:r>
-            <w:r>
-              <w:rPr>
-                <w:color w:val="006600"/>
-              </w:rPr>
+              <w:t>Ví dụ Test Case — Đầu vào (Input): 5 3 0 2 -1  |  Đầu ra (Output): DA NHAP SO AM và -1</w:t>
             </w:r>
           </w:p>
         </w:tc>

</xml_diff>